<commit_message>
docs: sync public v1 with the relocated allocation tag step
</commit_message>
<xml_diff>
--- a/docs/NetBox-EDA-Technical-Documentation-public-v1.docx
+++ b/docs/NetBox-EDA-Technical-Documentation-public-v1.docx
@@ -20454,7 +20454,7 @@
         </w:r>
       </w:hyperlink>
       <w:r>
-        <w:t>). Allocation pool tags can be pre-created beforehand.</w:t>
+        <w:t>). Allocation pool tags can be pre-created — see below.</w:t>
       </w:r>
       <w:r/>
       <w:r/>
@@ -20495,6 +20495,184 @@
         <w:t>.</w:t>
       </w:r>
     </w:p>
+    <w:p>
+      <w:bookmarkStart w:id="100" w:name="X05e35bcc6654480b38262d625cbfc1be4f0e185"/>
+      <w:r>
+        <w:t>If you create the pools through the NetBox UI, create the tags first — the script below creates them for you:</w:t>
+      </w:r>
+    </w:p>
+    <w:p>
+      <w:pPr>
+        <w:numPr>
+          <w:ilvl w:val="0"/>
+          <w:numId w:val="20"/>
+        </w:numPr>
+      </w:pPr>
+      <w:r>
+        <w:rPr>
+          <w:b/>
+          <w:bCs/>
+        </w:rPr>
+        <w:t>Customization → Tags → Add</w:t>
+      </w:r>
+      <w:r>
+        <w:t xml:space="preserve"> (repeat for each)</w:t>
+      </w:r>
+    </w:p>
+    <w:tbl>
+      <w:tblPr>
+        <w:tblStyle w:val="TableGrid"/>
+        <w:tblW w:w="5000" w:type="pct"/>
+        <w:tblBorders>
+          <w:top w:val="single" w:sz="4" w:space="0" w:color="BFBFBF"/>
+          <w:left w:val="single" w:sz="4" w:space="0" w:color="BFBFBF"/>
+          <w:bottom w:val="single" w:sz="4" w:space="0" w:color="BFBFBF"/>
+          <w:right w:val="single" w:sz="4" w:space="0" w:color="BFBFBF"/>
+          <w:insideH w:val="single" w:sz="4" w:space="0" w:color="BFBFBF"/>
+          <w:insideV w:val="single" w:sz="4" w:space="0" w:color="BFBFBF"/>
+        </w:tblBorders>
+        <w:tblLook w:val="0020" w:firstRow="1" w:lastRow="0" w:firstColumn="0" w:lastColumn="0" w:noHBand="0" w:noVBand="0"/>
+      </w:tblPr>
+      <w:tblGrid>
+        <w:gridCol w:w="5368"/>
+        <w:gridCol w:w="4064"/>
+      </w:tblGrid>
+      <w:tr>
+        <w:trPr>
+          <w:tblHeader/>
+        </w:trPr>
+        <w:tc>
+          <w:tcPr>
+            <w:tcW w:w="0" w:type="auto"/>
+          </w:tcPr>
+          <w:p>
+            <w:r>
+              <w:t>Tag name</w:t>
+            </w:r>
+          </w:p>
+        </w:tc>
+        <w:tc>
+          <w:tcPr>
+            <w:tcW w:w="0" w:type="auto"/>
+          </w:tcPr>
+          <w:p>
+            <w:r>
+              <w:t>Used on</w:t>
+            </w:r>
+          </w:p>
+        </w:tc>
+      </w:tr>
+      <w:tr>
+        <w:tc>
+          <w:tcPr>
+            <w:tcW w:w="0" w:type="auto"/>
+          </w:tcPr>
+          <w:p>
+            <w:r>
+              <w:t>eda-fabric-dc2-vlan</w:t>
+            </w:r>
+          </w:p>
+        </w:tc>
+        <w:tc>
+          <w:tcPr>
+            <w:tcW w:w="0" w:type="auto"/>
+          </w:tcPr>
+          <w:p>
+            <w:r>
+              <w:t>VLAN Group</w:t>
+            </w:r>
+          </w:p>
+        </w:tc>
+      </w:tr>
+      <w:tr>
+        <w:tc>
+          <w:tcPr>
+            <w:tcW w:w="0" w:type="auto"/>
+          </w:tcPr>
+          <w:p>
+            <w:r>
+              <w:t>eda-fabric-dc2-asn</w:t>
+            </w:r>
+          </w:p>
+        </w:tc>
+        <w:tc>
+          <w:tcPr>
+            <w:tcW w:w="0" w:type="auto"/>
+          </w:tcPr>
+          <w:p>
+            <w:r>
+              <w:t>ASN Range</w:t>
+            </w:r>
+          </w:p>
+        </w:tc>
+      </w:tr>
+      <w:tr>
+        <w:tc>
+          <w:tcPr>
+            <w:tcW w:w="0" w:type="auto"/>
+          </w:tcPr>
+          <w:p>
+            <w:r>
+              <w:t>eda-fabric-dc2-systemip</w:t>
+            </w:r>
+          </w:p>
+        </w:tc>
+        <w:tc>
+          <w:tcPr>
+            <w:tcW w:w="0" w:type="auto"/>
+          </w:tcPr>
+          <w:p>
+            <w:r>
+              <w:t>Prefix (Active)</w:t>
+            </w:r>
+          </w:p>
+        </w:tc>
+      </w:tr>
+      <w:tr>
+        <w:tc>
+          <w:tcPr>
+            <w:tcW w:w="0" w:type="auto"/>
+          </w:tcPr>
+          <w:p>
+            <w:r>
+              <w:t>eda-fabric-dc2-mgmt</w:t>
+            </w:r>
+          </w:p>
+        </w:tc>
+        <w:tc>
+          <w:tcPr>
+            <w:tcW w:w="0" w:type="auto"/>
+          </w:tcPr>
+          <w:p>
+            <w:r>
+              <w:t>Prefix (Active)</w:t>
+            </w:r>
+          </w:p>
+        </w:tc>
+      </w:tr>
+      <w:tr>
+        <w:tc>
+          <w:tcPr>
+            <w:tcW w:w="0" w:type="auto"/>
+          </w:tcPr>
+          <w:p>
+            <w:r>
+              <w:t>eda-fabric-dc2-isl</w:t>
+            </w:r>
+          </w:p>
+        </w:tc>
+        <w:tc>
+          <w:tcPr>
+            <w:tcW w:w="0" w:type="auto"/>
+          </w:tcPr>
+          <w:p>
+            <w:r>
+              <w:t>Prefix (Container)</w:t>
+            </w:r>
+          </w:p>
+        </w:tc>
+      </w:tr>
+    </w:tbl>
     <w:p>
       <w:pPr>
         <w:pStyle w:val="Heading4"/>
@@ -26000,209 +26178,6 @@
       </w:r>
       <w:r>
         <w:t xml:space="preserve"> – we are using Mode B namespace for reference.</w:t>
-      </w:r>
-    </w:p>
-    <w:p>
-      <w:bookmarkStart w:id="100" w:name="X05e35bcc6654480b38262d625cbfc1be4f0e185"/>
-      <w:r>
-        <w:t xml:space="preserve">If you plan to test IPAM allocations, create </w:t>
-      </w:r>
-      <w:r>
-        <w:rPr>
-          <w:b/>
-          <w:bCs/>
-        </w:rPr>
-        <w:t>plain string</w:t>
-      </w:r>
-      <w:r>
-        <w:t xml:space="preserve"> tags now:</w:t>
-      </w:r>
-    </w:p>
-    <w:p>
-      <w:pPr>
-        <w:numPr>
-          <w:ilvl w:val="0"/>
-          <w:numId w:val="20"/>
-        </w:numPr>
-      </w:pPr>
-      <w:r>
-        <w:rPr>
-          <w:b/>
-          <w:bCs/>
-        </w:rPr>
-        <w:t>Customization → Tags → Add</w:t>
-      </w:r>
-      <w:r>
-        <w:t xml:space="preserve"> (repeat for each)</w:t>
-      </w:r>
-    </w:p>
-    <w:tbl>
-      <w:tblPr>
-        <w:tblStyle w:val="TableGrid"/>
-        <w:tblW w:w="5000" w:type="pct"/>
-        <w:tblBorders>
-          <w:top w:val="single" w:sz="4" w:space="0" w:color="BFBFBF"/>
-          <w:left w:val="single" w:sz="4" w:space="0" w:color="BFBFBF"/>
-          <w:bottom w:val="single" w:sz="4" w:space="0" w:color="BFBFBF"/>
-          <w:right w:val="single" w:sz="4" w:space="0" w:color="BFBFBF"/>
-          <w:insideH w:val="single" w:sz="4" w:space="0" w:color="BFBFBF"/>
-          <w:insideV w:val="single" w:sz="4" w:space="0" w:color="BFBFBF"/>
-        </w:tblBorders>
-        <w:tblLook w:val="0020" w:firstRow="1" w:lastRow="0" w:firstColumn="0" w:lastColumn="0" w:noHBand="0" w:noVBand="0"/>
-      </w:tblPr>
-      <w:tblGrid>
-        <w:gridCol w:w="5368"/>
-        <w:gridCol w:w="4064"/>
-      </w:tblGrid>
-      <w:tr>
-        <w:trPr>
-          <w:tblHeader/>
-        </w:trPr>
-        <w:tc>
-          <w:tcPr>
-            <w:tcW w:w="0" w:type="auto"/>
-          </w:tcPr>
-          <w:p>
-            <w:r>
-              <w:t>Tag name</w:t>
-            </w:r>
-          </w:p>
-        </w:tc>
-        <w:tc>
-          <w:tcPr>
-            <w:tcW w:w="0" w:type="auto"/>
-          </w:tcPr>
-          <w:p>
-            <w:r>
-              <w:t>Used on</w:t>
-            </w:r>
-          </w:p>
-        </w:tc>
-      </w:tr>
-      <w:tr>
-        <w:tc>
-          <w:tcPr>
-            <w:tcW w:w="0" w:type="auto"/>
-          </w:tcPr>
-          <w:p>
-            <w:r>
-              <w:t>eda-fabric-dc2-vlan</w:t>
-            </w:r>
-          </w:p>
-        </w:tc>
-        <w:tc>
-          <w:tcPr>
-            <w:tcW w:w="0" w:type="auto"/>
-          </w:tcPr>
-          <w:p>
-            <w:r>
-              <w:t>VLAN Group</w:t>
-            </w:r>
-          </w:p>
-        </w:tc>
-      </w:tr>
-      <w:tr>
-        <w:tc>
-          <w:tcPr>
-            <w:tcW w:w="0" w:type="auto"/>
-          </w:tcPr>
-          <w:p>
-            <w:r>
-              <w:t>eda-fabric-dc2-asn</w:t>
-            </w:r>
-          </w:p>
-        </w:tc>
-        <w:tc>
-          <w:tcPr>
-            <w:tcW w:w="0" w:type="auto"/>
-          </w:tcPr>
-          <w:p>
-            <w:r>
-              <w:t>ASN Range</w:t>
-            </w:r>
-          </w:p>
-        </w:tc>
-      </w:tr>
-      <w:tr>
-        <w:tc>
-          <w:tcPr>
-            <w:tcW w:w="0" w:type="auto"/>
-          </w:tcPr>
-          <w:p>
-            <w:r>
-              <w:t>eda-fabric-dc2-systemip</w:t>
-            </w:r>
-          </w:p>
-        </w:tc>
-        <w:tc>
-          <w:tcPr>
-            <w:tcW w:w="0" w:type="auto"/>
-          </w:tcPr>
-          <w:p>
-            <w:r>
-              <w:t>Prefix (Active)</w:t>
-            </w:r>
-          </w:p>
-        </w:tc>
-      </w:tr>
-      <w:tr>
-        <w:tc>
-          <w:tcPr>
-            <w:tcW w:w="0" w:type="auto"/>
-          </w:tcPr>
-          <w:p>
-            <w:r>
-              <w:t>eda-fabric-dc2-mgmt</w:t>
-            </w:r>
-          </w:p>
-        </w:tc>
-        <w:tc>
-          <w:tcPr>
-            <w:tcW w:w="0" w:type="auto"/>
-          </w:tcPr>
-          <w:p>
-            <w:r>
-              <w:t>Prefix (Active)</w:t>
-            </w:r>
-          </w:p>
-        </w:tc>
-      </w:tr>
-      <w:tr>
-        <w:tc>
-          <w:tcPr>
-            <w:tcW w:w="0" w:type="auto"/>
-          </w:tcPr>
-          <w:p>
-            <w:r>
-              <w:t>eda-fabric-dc2-isl</w:t>
-            </w:r>
-          </w:p>
-        </w:tc>
-        <w:tc>
-          <w:tcPr>
-            <w:tcW w:w="0" w:type="auto"/>
-          </w:tcPr>
-          <w:p>
-            <w:r>
-              <w:t>Prefix (Container)</w:t>
-            </w:r>
-          </w:p>
-        </w:tc>
-      </w:tr>
-    </w:tbl>
-    <w:p>
-      <w:r>
-        <w:t xml:space="preserve">Allocation tags are </w:t>
-      </w:r>
-      <w:r>
-        <w:rPr>
-          <w:b/>
-          <w:bCs/>
-        </w:rPr>
-        <w:t>not</w:t>
-      </w:r>
-      <w:r>
-        <w:t xml:space="preserve"> key=value device tags. Skip this subsection if you are only doing DCIM import.</w:t>
       </w:r>
     </w:p>
     <w:bookmarkEnd w:id="100"/>

</xml_diff>

<commit_message>
docs: sync public v1 — legend wording and separated 5.8 tables
</commit_message>
<xml_diff>
--- a/docs/NetBox-EDA-Technical-Documentation-public-v1.docx
+++ b/docs/NetBox-EDA-Technical-Documentation-public-v1.docx
@@ -40,16 +40,7 @@
     </w:p>
     <w:p>
       <w:r>
-        <w:t>Note</w:t>
-      </w:r>
-      <w:r>
-        <w:t xml:space="preserve">: </w:t>
-      </w:r>
-      <w:r>
-        <w:t xml:space="preserve">This is a </w:t>
-      </w:r>
-      <w:r>
-        <w:t>Lab-validated integration guide. This is a summary of the full technical documentation and is not official Nokia product documentation.</w:t>
+        <w:t>Note: This is a Lab-validated integration guide. This is a summary of the full technical documentation and is not official Nokia product documentation.</w:t>
       </w:r>
     </w:p>
     <w:p>
@@ -6126,7 +6117,13 @@
         <w:t>Section numbering:</w:t>
       </w:r>
       <w:r>
-        <w:t xml:space="preserve"> §4 = Mode A · §5 = Mode B (step number = section number in §5.1 build order) · §6 = IPAM theory.</w:t>
+        <w:t xml:space="preserve"> §4 = Mode A · §5 = Mode B (step number = section number in §5.1 build order) · §6 = IPAM </w:t>
+      </w:r>
+      <w:r>
+        <w:t>Allocations</w:t>
+      </w:r>
+      <w:r>
+        <w:t>.</w:t>
       </w:r>
     </w:p>
     <w:p>
@@ -6380,8 +6377,8 @@
         <w:tblLook w:val="0020" w:firstRow="1" w:lastRow="0" w:firstColumn="0" w:lastColumn="0" w:noHBand="0" w:noVBand="0"/>
       </w:tblPr>
       <w:tblGrid>
-        <w:gridCol w:w="4469"/>
-        <w:gridCol w:w="4963"/>
+        <w:gridCol w:w="5263"/>
+        <w:gridCol w:w="4169"/>
       </w:tblGrid>
       <w:tr>
         <w:trPr>
@@ -21935,6 +21932,7 @@
       <w:bookmarkStart w:id="68" w:name="create-webhook-in-netbox"/>
       <w:bookmarkEnd w:id="67"/>
       <w:r>
+        <w:lastRenderedPageBreak/>
         <w:t xml:space="preserve">5.3.3 Create webhook in </w:t>
       </w:r>
       <w:proofErr w:type="spellStart"/>
@@ -24695,10 +24693,7 @@
     </w:p>
     <w:p>
       <w:r>
-        <w:t xml:space="preserve">Copy </w:t>
-      </w:r>
-      <w:r>
-        <w:t xml:space="preserve">scripts/nb-test-fabric-dc2.py to manifests/nb-test-fabric-dc2.py and </w:t>
+        <w:t xml:space="preserve">Copy scripts/nb-test-fabric-dc2.py to manifests/nb-test-fabric-dc2.py and </w:t>
       </w:r>
       <w:r>
         <w:rPr>
@@ -25109,10 +25104,7 @@
     </w:p>
     <w:p>
       <w:r>
-        <w:t xml:space="preserve">After saving the script </w:t>
-      </w:r>
-      <w:r>
-        <w:t xml:space="preserve">to disk, copy into the </w:t>
+        <w:t xml:space="preserve">After saving the script to disk, copy into the </w:t>
       </w:r>
       <w:proofErr w:type="spellStart"/>
       <w:r>
@@ -26522,10 +26514,7 @@
         <w:t>File:</w:t>
       </w:r>
       <w:r>
-        <w:t xml:space="preserve"> nb-test-allocation-pools-fabric-dc2.py</w:t>
-      </w:r>
-      <w:r>
-        <w:t xml:space="preserve">. Creates all five </w:t>
+        <w:t xml:space="preserve"> nb-test-allocation-pools-fabric-dc2.py. Creates all five </w:t>
       </w:r>
       <w:proofErr w:type="spellStart"/>
       <w:r>
@@ -27012,7 +27001,6 @@
           <w:b/>
           <w:bCs/>
         </w:rPr>
-        <w:lastRenderedPageBreak/>
         <w:t>Slug:</w:t>
       </w:r>
       <w:r>
@@ -27031,6 +27019,7 @@
           <w:b/>
           <w:bCs/>
         </w:rPr>
+        <w:lastRenderedPageBreak/>
         <w:t>Minimum VID / Maximum VID:</w:t>
       </w:r>
       <w:r>
@@ -27875,7 +27864,6 @@
           <w:b/>
           <w:bCs/>
         </w:rPr>
-        <w:lastRenderedPageBreak/>
         <w:t>Prefix:</w:t>
       </w:r>
       <w:r>
@@ -27894,6 +27882,7 @@
           <w:b/>
           <w:bCs/>
         </w:rPr>
+        <w:lastRenderedPageBreak/>
         <w:t>Status:</w:t>
       </w:r>
       <w:r>
@@ -28761,7 +28750,6 @@
           <w:b/>
           <w:bCs/>
         </w:rPr>
-        <w:lastRenderedPageBreak/>
         <w:t>Prefix:</w:t>
       </w:r>
       <w:r>
@@ -28780,6 +28768,7 @@
           <w:b/>
           <w:bCs/>
         </w:rPr>
+        <w:lastRenderedPageBreak/>
         <w:t>Status:</w:t>
       </w:r>
       <w:r>
@@ -29954,61 +29943,61 @@
         <w:rPr>
           <w:rStyle w:val="AttributeTok"/>
         </w:rPr>
+        <w:t xml:space="preserve">  </w:t>
+      </w:r>
+      <w:r>
+        <w:rPr>
+          <w:rStyle w:val="FunctionTok"/>
+        </w:rPr>
+        <w:t>name</w:t>
+      </w:r>
+      <w:r>
+        <w:rPr>
+          <w:rStyle w:val="KeywordTok"/>
+        </w:rPr>
+        <w:t>:</w:t>
+      </w:r>
+      <w:r>
+        <w:rPr>
+          <w:rStyle w:val="AttributeTok"/>
+        </w:rPr>
+        <w:t xml:space="preserve"> eda-isl-ipv6</w:t>
+      </w:r>
+      <w:r>
+        <w:br/>
+      </w:r>
+      <w:r>
+        <w:rPr>
+          <w:rStyle w:val="AttributeTok"/>
+        </w:rPr>
+        <w:t xml:space="preserve">  </w:t>
+      </w:r>
+      <w:r>
+        <w:rPr>
+          <w:rStyle w:val="FunctionTok"/>
+        </w:rPr>
+        <w:t>namespace</w:t>
+      </w:r>
+      <w:r>
+        <w:rPr>
+          <w:rStyle w:val="KeywordTok"/>
+        </w:rPr>
+        <w:t>:</w:t>
+      </w:r>
+      <w:r>
+        <w:rPr>
+          <w:rStyle w:val="AttributeTok"/>
+        </w:rPr>
+        <w:t xml:space="preserve"> clab-3-tier-leaf-spine-dcgw</w:t>
+      </w:r>
+      <w:r>
+        <w:br/>
+      </w:r>
+      <w:r>
+        <w:rPr>
+          <w:rStyle w:val="FunctionTok"/>
+        </w:rPr>
         <w:lastRenderedPageBreak/>
-        <w:t xml:space="preserve">  </w:t>
-      </w:r>
-      <w:r>
-        <w:rPr>
-          <w:rStyle w:val="FunctionTok"/>
-        </w:rPr>
-        <w:t>name</w:t>
-      </w:r>
-      <w:r>
-        <w:rPr>
-          <w:rStyle w:val="KeywordTok"/>
-        </w:rPr>
-        <w:t>:</w:t>
-      </w:r>
-      <w:r>
-        <w:rPr>
-          <w:rStyle w:val="AttributeTok"/>
-        </w:rPr>
-        <w:t xml:space="preserve"> eda-isl-ipv6</w:t>
-      </w:r>
-      <w:r>
-        <w:br/>
-      </w:r>
-      <w:r>
-        <w:rPr>
-          <w:rStyle w:val="AttributeTok"/>
-        </w:rPr>
-        <w:t xml:space="preserve">  </w:t>
-      </w:r>
-      <w:r>
-        <w:rPr>
-          <w:rStyle w:val="FunctionTok"/>
-        </w:rPr>
-        <w:t>namespace</w:t>
-      </w:r>
-      <w:r>
-        <w:rPr>
-          <w:rStyle w:val="KeywordTok"/>
-        </w:rPr>
-        <w:t>:</w:t>
-      </w:r>
-      <w:r>
-        <w:rPr>
-          <w:rStyle w:val="AttributeTok"/>
-        </w:rPr>
-        <w:t xml:space="preserve"> clab-3-tier-leaf-spine-dcgw</w:t>
-      </w:r>
-      <w:r>
-        <w:br/>
-      </w:r>
-      <w:r>
-        <w:rPr>
-          <w:rStyle w:val="FunctionTok"/>
-        </w:rPr>
         <w:t>spec</w:t>
       </w:r>
       <w:r>
@@ -31127,43 +31116,43 @@
         <w:rPr>
           <w:rStyle w:val="FunctionTok"/>
         </w:rPr>
+        <w:t>kind</w:t>
+      </w:r>
+      <w:r>
+        <w:rPr>
+          <w:rStyle w:val="KeywordTok"/>
+        </w:rPr>
+        <w:t>:</w:t>
+      </w:r>
+      <w:r>
+        <w:rPr>
+          <w:rStyle w:val="AttributeTok"/>
+        </w:rPr>
+        <w:t xml:space="preserve"> Allocation</w:t>
+      </w:r>
+      <w:r>
+        <w:br/>
+      </w:r>
+      <w:r>
+        <w:rPr>
+          <w:rStyle w:val="FunctionTok"/>
+        </w:rPr>
+        <w:t>metadata</w:t>
+      </w:r>
+      <w:r>
+        <w:rPr>
+          <w:rStyle w:val="KeywordTok"/>
+        </w:rPr>
+        <w:t>:</w:t>
+      </w:r>
+      <w:r>
+        <w:br/>
+      </w:r>
+      <w:r>
+        <w:rPr>
+          <w:rStyle w:val="AttributeTok"/>
+        </w:rPr>
         <w:lastRenderedPageBreak/>
-        <w:t>kind</w:t>
-      </w:r>
-      <w:r>
-        <w:rPr>
-          <w:rStyle w:val="KeywordTok"/>
-        </w:rPr>
-        <w:t>:</w:t>
-      </w:r>
-      <w:r>
-        <w:rPr>
-          <w:rStyle w:val="AttributeTok"/>
-        </w:rPr>
-        <w:t xml:space="preserve"> Allocation</w:t>
-      </w:r>
-      <w:r>
-        <w:br/>
-      </w:r>
-      <w:r>
-        <w:rPr>
-          <w:rStyle w:val="FunctionTok"/>
-        </w:rPr>
-        <w:t>metadata</w:t>
-      </w:r>
-      <w:r>
-        <w:rPr>
-          <w:rStyle w:val="KeywordTok"/>
-        </w:rPr>
-        <w:t>:</w:t>
-      </w:r>
-      <w:r>
-        <w:br/>
-      </w:r>
-      <w:r>
-        <w:rPr>
-          <w:rStyle w:val="AttributeTok"/>
-        </w:rPr>
         <w:t xml:space="preserve">  </w:t>
       </w:r>
       <w:r>
@@ -32362,7 +32351,6 @@
           </w:tcPr>
           <w:p>
             <w:r>
-              <w:lastRenderedPageBreak/>
               <w:t>nb-fabric-dc2-systemip</w:t>
             </w:r>
           </w:p>
@@ -32431,6 +32419,7 @@
           </w:tcPr>
           <w:p>
             <w:r>
+              <w:lastRenderedPageBreak/>
               <w:t>nb-fabric-dc2-isl</w:t>
             </w:r>
           </w:p>
@@ -32780,6 +32769,11 @@
         </w:tc>
       </w:tr>
     </w:tbl>
+    <w:p>
+      <w:pPr>
+        <w:pStyle w:val="BodyText"/>
+      </w:pPr>
+    </w:p>
     <w:tbl>
       <w:tblPr>
         <w:tblStyle w:val="TableGrid"/>
@@ -33093,7 +33087,6 @@
     <w:p/>
     <w:p>
       <w:r>
-        <w:lastRenderedPageBreak/>
         <w:t xml:space="preserve">IPAM allocation pools are </w:t>
       </w:r>
       <w:r>
@@ -33130,6 +33123,7 @@
       <w:bookmarkStart w:id="101" w:name="_Toc237609206"/>
       <w:bookmarkStart w:id="102" w:name="X8992998f9dea9535975a56f6d3de3543401dd03"/>
       <w:r>
+        <w:lastRenderedPageBreak/>
         <w:t>6.1 Architecture — one Instance per EDA namespace</w:t>
       </w:r>
       <w:bookmarkEnd w:id="101"/>
@@ -34042,118 +34036,118 @@
         <w:rPr>
           <w:rStyle w:val="AttributeTok"/>
         </w:rPr>
+        <w:t xml:space="preserve">  </w:t>
+      </w:r>
+      <w:r>
+        <w:rPr>
+          <w:rStyle w:val="FunctionTok"/>
+        </w:rPr>
+        <w:t>timeout</w:t>
+      </w:r>
+      <w:r>
+        <w:rPr>
+          <w:rStyle w:val="KeywordTok"/>
+        </w:rPr>
+        <w:t>:</w:t>
+      </w:r>
+      <w:r>
+        <w:rPr>
+          <w:rStyle w:val="AttributeTok"/>
+        </w:rPr>
+        <w:t xml:space="preserve"> 10s</w:t>
+      </w:r>
+      <w:r>
+        <w:rPr>
+          <w:rStyle w:val="CommentTok"/>
+        </w:rPr>
+        <w:t xml:space="preserve">                    # per-request API timeout (default 10s)</w:t>
+      </w:r>
+      <w:r>
+        <w:br/>
+      </w:r>
+      <w:r>
+        <w:rPr>
+          <w:rStyle w:val="AttributeTok"/>
+        </w:rPr>
+        <w:t xml:space="preserve">  </w:t>
+      </w:r>
+      <w:proofErr w:type="spellStart"/>
+      <w:r>
+        <w:rPr>
+          <w:rStyle w:val="FunctionTok"/>
+        </w:rPr>
+        <w:t>disableWebhook</w:t>
+      </w:r>
+      <w:proofErr w:type="spellEnd"/>
+      <w:r>
+        <w:rPr>
+          <w:rStyle w:val="KeywordTok"/>
+        </w:rPr>
+        <w:t>:</w:t>
+      </w:r>
+      <w:r>
+        <w:rPr>
+          <w:rStyle w:val="AttributeTok"/>
+        </w:rPr>
+        <w:t xml:space="preserve"> </w:t>
+      </w:r>
+      <w:r>
+        <w:rPr>
+          <w:rStyle w:val="CharTok"/>
+        </w:rPr>
+        <w:t>false</w:t>
+      </w:r>
+      <w:r>
+        <w:rPr>
+          <w:rStyle w:val="CommentTok"/>
+        </w:rPr>
+        <w:t xml:space="preserve">           # true = no auto-reconcile on </w:t>
+      </w:r>
+      <w:proofErr w:type="spellStart"/>
+      <w:r>
+        <w:rPr>
+          <w:rStyle w:val="CommentTok"/>
+        </w:rPr>
+        <w:t>NetBox</w:t>
+      </w:r>
+      <w:proofErr w:type="spellEnd"/>
+      <w:r>
+        <w:rPr>
+          <w:rStyle w:val="CommentTok"/>
+        </w:rPr>
+        <w:t xml:space="preserve"> events</w:t>
+      </w:r>
+      <w:r>
+        <w:br/>
+      </w:r>
+      <w:r>
+        <w:rPr>
+          <w:rStyle w:val="AttributeTok"/>
+        </w:rPr>
+        <w:t xml:space="preserve">  </w:t>
+      </w:r>
+      <w:proofErr w:type="spellStart"/>
+      <w:r>
+        <w:rPr>
+          <w:rStyle w:val="FunctionTok"/>
+        </w:rPr>
+        <w:t>tls</w:t>
+      </w:r>
+      <w:proofErr w:type="spellEnd"/>
+      <w:r>
+        <w:rPr>
+          <w:rStyle w:val="KeywordTok"/>
+        </w:rPr>
+        <w:t>:</w:t>
+      </w:r>
+      <w:r>
+        <w:br/>
+      </w:r>
+      <w:r>
+        <w:rPr>
+          <w:rStyle w:val="AttributeTok"/>
+        </w:rPr>
         <w:lastRenderedPageBreak/>
-        <w:t xml:space="preserve">  </w:t>
-      </w:r>
-      <w:r>
-        <w:rPr>
-          <w:rStyle w:val="FunctionTok"/>
-        </w:rPr>
-        <w:t>timeout</w:t>
-      </w:r>
-      <w:r>
-        <w:rPr>
-          <w:rStyle w:val="KeywordTok"/>
-        </w:rPr>
-        <w:t>:</w:t>
-      </w:r>
-      <w:r>
-        <w:rPr>
-          <w:rStyle w:val="AttributeTok"/>
-        </w:rPr>
-        <w:t xml:space="preserve"> 10s</w:t>
-      </w:r>
-      <w:r>
-        <w:rPr>
-          <w:rStyle w:val="CommentTok"/>
-        </w:rPr>
-        <w:t xml:space="preserve">                    # per-request API timeout (default 10s)</w:t>
-      </w:r>
-      <w:r>
-        <w:br/>
-      </w:r>
-      <w:r>
-        <w:rPr>
-          <w:rStyle w:val="AttributeTok"/>
-        </w:rPr>
-        <w:t xml:space="preserve">  </w:t>
-      </w:r>
-      <w:proofErr w:type="spellStart"/>
-      <w:r>
-        <w:rPr>
-          <w:rStyle w:val="FunctionTok"/>
-        </w:rPr>
-        <w:t>disableWebhook</w:t>
-      </w:r>
-      <w:proofErr w:type="spellEnd"/>
-      <w:r>
-        <w:rPr>
-          <w:rStyle w:val="KeywordTok"/>
-        </w:rPr>
-        <w:t>:</w:t>
-      </w:r>
-      <w:r>
-        <w:rPr>
-          <w:rStyle w:val="AttributeTok"/>
-        </w:rPr>
-        <w:t xml:space="preserve"> </w:t>
-      </w:r>
-      <w:r>
-        <w:rPr>
-          <w:rStyle w:val="CharTok"/>
-        </w:rPr>
-        <w:t>false</w:t>
-      </w:r>
-      <w:r>
-        <w:rPr>
-          <w:rStyle w:val="CommentTok"/>
-        </w:rPr>
-        <w:t xml:space="preserve">           # true = no auto-reconcile on </w:t>
-      </w:r>
-      <w:proofErr w:type="spellStart"/>
-      <w:r>
-        <w:rPr>
-          <w:rStyle w:val="CommentTok"/>
-        </w:rPr>
-        <w:t>NetBox</w:t>
-      </w:r>
-      <w:proofErr w:type="spellEnd"/>
-      <w:r>
-        <w:rPr>
-          <w:rStyle w:val="CommentTok"/>
-        </w:rPr>
-        <w:t xml:space="preserve"> events</w:t>
-      </w:r>
-      <w:r>
-        <w:br/>
-      </w:r>
-      <w:r>
-        <w:rPr>
-          <w:rStyle w:val="AttributeTok"/>
-        </w:rPr>
-        <w:t xml:space="preserve">  </w:t>
-      </w:r>
-      <w:proofErr w:type="spellStart"/>
-      <w:r>
-        <w:rPr>
-          <w:rStyle w:val="FunctionTok"/>
-        </w:rPr>
-        <w:t>tls</w:t>
-      </w:r>
-      <w:proofErr w:type="spellEnd"/>
-      <w:r>
-        <w:rPr>
-          <w:rStyle w:val="KeywordTok"/>
-        </w:rPr>
-        <w:t>:</w:t>
-      </w:r>
-      <w:r>
-        <w:br/>
-      </w:r>
-      <w:r>
-        <w:rPr>
-          <w:rStyle w:val="AttributeTok"/>
-        </w:rPr>
         <w:t xml:space="preserve">    </w:t>
       </w:r>
       <w:proofErr w:type="spellStart"/>
@@ -35364,7 +35358,6 @@
           </w:tcPr>
           <w:p>
             <w:r>
-              <w:lastRenderedPageBreak/>
               <w:t>subnet</w:t>
             </w:r>
           </w:p>
@@ -35536,6 +35529,7 @@
       <w:bookmarkStart w:id="108" w:name="X203573f8c0d301cf7c3ba740882c9a5e7645c5b"/>
       <w:bookmarkEnd w:id="107"/>
       <w:r>
+        <w:lastRenderedPageBreak/>
         <w:t xml:space="preserve">ASN allocation and </w:t>
       </w:r>
       <w:proofErr w:type="spellStart"/>
@@ -36353,21 +36347,329 @@
         <w:rPr>
           <w:rStyle w:val="CommentTok"/>
         </w:rPr>
+        <w:t># --- ASN (</w:t>
+      </w:r>
+      <w:proofErr w:type="spellStart"/>
+      <w:r>
+        <w:rPr>
+          <w:rStyle w:val="CommentTok"/>
+        </w:rPr>
+        <w:t>IndexAllocationPool</w:t>
+      </w:r>
+      <w:proofErr w:type="spellEnd"/>
+      <w:r>
+        <w:rPr>
+          <w:rStyle w:val="CommentTok"/>
+        </w:rPr>
+        <w:t>) ---</w:t>
+      </w:r>
+      <w:r>
+        <w:br/>
+      </w:r>
+      <w:proofErr w:type="spellStart"/>
+      <w:r>
+        <w:rPr>
+          <w:rStyle w:val="FunctionTok"/>
+        </w:rPr>
+        <w:t>apiVersion</w:t>
+      </w:r>
+      <w:proofErr w:type="spellEnd"/>
+      <w:r>
+        <w:rPr>
+          <w:rStyle w:val="KeywordTok"/>
+        </w:rPr>
+        <w:t>:</w:t>
+      </w:r>
+      <w:r>
+        <w:rPr>
+          <w:rStyle w:val="AttributeTok"/>
+        </w:rPr>
+        <w:t xml:space="preserve"> netbox.eda.nokia.com/v1alpha1</w:t>
+      </w:r>
+      <w:r>
+        <w:br/>
+      </w:r>
+      <w:r>
+        <w:rPr>
+          <w:rStyle w:val="FunctionTok"/>
+        </w:rPr>
+        <w:t>kind</w:t>
+      </w:r>
+      <w:r>
+        <w:rPr>
+          <w:rStyle w:val="KeywordTok"/>
+        </w:rPr>
+        <w:t>:</w:t>
+      </w:r>
+      <w:r>
+        <w:rPr>
+          <w:rStyle w:val="AttributeTok"/>
+        </w:rPr>
+        <w:t xml:space="preserve"> Allocation</w:t>
+      </w:r>
+      <w:r>
+        <w:br/>
+      </w:r>
+      <w:r>
+        <w:rPr>
+          <w:rStyle w:val="FunctionTok"/>
+        </w:rPr>
+        <w:t>metadata</w:t>
+      </w:r>
+      <w:r>
+        <w:rPr>
+          <w:rStyle w:val="KeywordTok"/>
+        </w:rPr>
+        <w:t>:</w:t>
+      </w:r>
+      <w:r>
+        <w:br/>
+      </w:r>
+      <w:r>
+        <w:rPr>
+          <w:rStyle w:val="AttributeTok"/>
+        </w:rPr>
+        <w:t xml:space="preserve">  </w:t>
+      </w:r>
+      <w:r>
+        <w:rPr>
+          <w:rStyle w:val="FunctionTok"/>
+        </w:rPr>
+        <w:t>name</w:t>
+      </w:r>
+      <w:r>
+        <w:rPr>
+          <w:rStyle w:val="KeywordTok"/>
+        </w:rPr>
+        <w:t>:</w:t>
+      </w:r>
+      <w:r>
+        <w:rPr>
+          <w:rStyle w:val="AttributeTok"/>
+        </w:rPr>
+        <w:t xml:space="preserve"> nb-fabric-dc2-asn-pool</w:t>
+      </w:r>
+      <w:r>
+        <w:br/>
+      </w:r>
+      <w:r>
+        <w:rPr>
+          <w:rStyle w:val="AttributeTok"/>
+        </w:rPr>
+        <w:t xml:space="preserve">  </w:t>
+      </w:r>
+      <w:r>
+        <w:rPr>
+          <w:rStyle w:val="FunctionTok"/>
+        </w:rPr>
+        <w:t>namespace</w:t>
+      </w:r>
+      <w:r>
+        <w:rPr>
+          <w:rStyle w:val="KeywordTok"/>
+        </w:rPr>
+        <w:t>:</w:t>
+      </w:r>
+      <w:r>
+        <w:rPr>
+          <w:rStyle w:val="AttributeTok"/>
+        </w:rPr>
+        <w:t xml:space="preserve"> fabric-dc2</w:t>
+      </w:r>
+      <w:r>
+        <w:br/>
+      </w:r>
+      <w:r>
+        <w:rPr>
+          <w:rStyle w:val="FunctionTok"/>
+        </w:rPr>
         <w:lastRenderedPageBreak/>
-        <w:t># --- ASN (</w:t>
-      </w:r>
-      <w:proofErr w:type="spellStart"/>
+        <w:t>spec</w:t>
+      </w:r>
+      <w:r>
+        <w:rPr>
+          <w:rStyle w:val="KeywordTok"/>
+        </w:rPr>
+        <w:t>:</w:t>
+      </w:r>
+      <w:r>
+        <w:br/>
+      </w:r>
+      <w:r>
+        <w:rPr>
+          <w:rStyle w:val="AttributeTok"/>
+        </w:rPr>
+        <w:t xml:space="preserve">  </w:t>
+      </w:r>
+      <w:r>
+        <w:rPr>
+          <w:rStyle w:val="FunctionTok"/>
+        </w:rPr>
+        <w:t>enabled</w:t>
+      </w:r>
+      <w:r>
+        <w:rPr>
+          <w:rStyle w:val="KeywordTok"/>
+        </w:rPr>
+        <w:t>:</w:t>
+      </w:r>
+      <w:r>
+        <w:rPr>
+          <w:rStyle w:val="AttributeTok"/>
+        </w:rPr>
+        <w:t xml:space="preserve"> </w:t>
+      </w:r>
+      <w:r>
+        <w:rPr>
+          <w:rStyle w:val="CharTok"/>
+        </w:rPr>
+        <w:t>true</w:t>
+      </w:r>
+      <w:r>
+        <w:br/>
+      </w:r>
+      <w:r>
+        <w:rPr>
+          <w:rStyle w:val="AttributeTok"/>
+        </w:rPr>
+        <w:t xml:space="preserve">  </w:t>
+      </w:r>
+      <w:r>
+        <w:rPr>
+          <w:rStyle w:val="FunctionTok"/>
+        </w:rPr>
+        <w:t>instance</w:t>
+      </w:r>
+      <w:r>
+        <w:rPr>
+          <w:rStyle w:val="KeywordTok"/>
+        </w:rPr>
+        <w:t>:</w:t>
+      </w:r>
+      <w:r>
+        <w:rPr>
+          <w:rStyle w:val="AttributeTok"/>
+        </w:rPr>
+        <w:t xml:space="preserve"> </w:t>
+      </w:r>
+      <w:proofErr w:type="spellStart"/>
+      <w:r>
+        <w:rPr>
+          <w:rStyle w:val="AttributeTok"/>
+        </w:rPr>
+        <w:t>netbox</w:t>
+      </w:r>
+      <w:proofErr w:type="spellEnd"/>
+      <w:r>
+        <w:br/>
+      </w:r>
+      <w:r>
+        <w:rPr>
+          <w:rStyle w:val="AttributeTok"/>
+        </w:rPr>
+        <w:t xml:space="preserve">  </w:t>
+      </w:r>
+      <w:r>
+        <w:rPr>
+          <w:rStyle w:val="FunctionTok"/>
+        </w:rPr>
+        <w:t>tags</w:t>
+      </w:r>
+      <w:r>
+        <w:rPr>
+          <w:rStyle w:val="KeywordTok"/>
+        </w:rPr>
+        <w:t>:</w:t>
+      </w:r>
+      <w:r>
+        <w:rPr>
+          <w:rStyle w:val="AttributeTok"/>
+        </w:rPr>
+        <w:t xml:space="preserve"> </w:t>
+      </w:r>
+      <w:r>
+        <w:rPr>
+          <w:rStyle w:val="KeywordTok"/>
+        </w:rPr>
+        <w:t>[</w:t>
+      </w:r>
+      <w:r>
+        <w:rPr>
+          <w:rStyle w:val="AttributeTok"/>
+        </w:rPr>
+        <w:t>eda-fabric-dc2-asn</w:t>
+      </w:r>
+      <w:r>
+        <w:rPr>
+          <w:rStyle w:val="KeywordTok"/>
+        </w:rPr>
+        <w:t>]</w:t>
+      </w:r>
+      <w:r>
+        <w:br/>
+      </w:r>
+      <w:r>
+        <w:rPr>
+          <w:rStyle w:val="AttributeTok"/>
+        </w:rPr>
+        <w:t xml:space="preserve">  </w:t>
+      </w:r>
+      <w:r>
+        <w:rPr>
+          <w:rStyle w:val="FunctionTok"/>
+        </w:rPr>
+        <w:t>type</w:t>
+      </w:r>
+      <w:r>
+        <w:rPr>
+          <w:rStyle w:val="KeywordTok"/>
+        </w:rPr>
+        <w:t>:</w:t>
+      </w:r>
+      <w:r>
+        <w:rPr>
+          <w:rStyle w:val="AttributeTok"/>
+        </w:rPr>
+        <w:t xml:space="preserve"> </w:t>
+      </w:r>
+      <w:proofErr w:type="spellStart"/>
+      <w:r>
+        <w:rPr>
+          <w:rStyle w:val="AttributeTok"/>
+        </w:rPr>
+        <w:t>asn</w:t>
+      </w:r>
+      <w:proofErr w:type="spellEnd"/>
+      <w:r>
+        <w:br/>
+      </w:r>
+      <w:r>
+        <w:rPr>
+          <w:rStyle w:val="PreprocessorTok"/>
+        </w:rPr>
+        <w:t>---</w:t>
+      </w:r>
+      <w:r>
+        <w:br/>
+      </w:r>
       <w:r>
         <w:rPr>
           <w:rStyle w:val="CommentTok"/>
         </w:rPr>
-        <w:t>IndexAllocationPool</w:t>
-      </w:r>
-      <w:proofErr w:type="spellEnd"/>
+        <w:t># --- System IPs (</w:t>
+      </w:r>
+      <w:proofErr w:type="spellStart"/>
       <w:r>
         <w:rPr>
           <w:rStyle w:val="CommentTok"/>
         </w:rPr>
+        <w:t>IPAllocationPool</w:t>
+      </w:r>
+      <w:proofErr w:type="spellEnd"/>
+      <w:r>
+        <w:rPr>
+          <w:rStyle w:val="CommentTok"/>
+        </w:rPr>
         <w:t>) ---</w:t>
       </w:r>
       <w:r>
@@ -36454,7 +36756,7 @@
         <w:rPr>
           <w:rStyle w:val="AttributeTok"/>
         </w:rPr>
-        <w:t xml:space="preserve"> nb-fabric-dc2-asn-pool</w:t>
+        <w:t xml:space="preserve"> nb-fabric-dc2-systemip</w:t>
       </w:r>
       <w:r>
         <w:br/>
@@ -36603,7 +36905,7 @@
         <w:rPr>
           <w:rStyle w:val="AttributeTok"/>
         </w:rPr>
-        <w:t>eda-fabric-dc2-asn</w:t>
+        <w:t>eda-fabric-dc2-systemip</w:t>
       </w:r>
       <w:r>
         <w:rPr>
@@ -36643,9 +36945,15 @@
         <w:rPr>
           <w:rStyle w:val="AttributeTok"/>
         </w:rPr>
-        <w:t>asn</w:t>
-      </w:r>
-      <w:proofErr w:type="spellEnd"/>
+        <w:t>ip</w:t>
+      </w:r>
+      <w:proofErr w:type="spellEnd"/>
+      <w:r>
+        <w:rPr>
+          <w:rStyle w:val="AttributeTok"/>
+        </w:rPr>
+        <w:t>-address</w:t>
+      </w:r>
       <w:r>
         <w:br/>
       </w:r>
@@ -36662,14 +36970,14 @@
         <w:rPr>
           <w:rStyle w:val="CommentTok"/>
         </w:rPr>
-        <w:t># --- System IPs (</w:t>
+        <w:t># --- Management IPs (</w:t>
       </w:r>
       <w:proofErr w:type="spellStart"/>
       <w:r>
         <w:rPr>
           <w:rStyle w:val="CommentTok"/>
         </w:rPr>
-        <w:t>IPAllocationPool</w:t>
+        <w:t>IPInSubnetAllocationPool</w:t>
       </w:r>
       <w:proofErr w:type="spellEnd"/>
       <w:r>
@@ -36762,7 +37070,7 @@
         <w:rPr>
           <w:rStyle w:val="AttributeTok"/>
         </w:rPr>
-        <w:t xml:space="preserve"> nb-fabric-dc2-systemip</w:t>
+        <w:t xml:space="preserve"> nb-fabric-dc2-mgmt</w:t>
       </w:r>
       <w:r>
         <w:br/>
@@ -36911,7 +37219,7 @@
         <w:rPr>
           <w:rStyle w:val="AttributeTok"/>
         </w:rPr>
-        <w:t>eda-fabric-dc2-systemip</w:t>
+        <w:t>eda-fabric-dc2-mgmt</w:t>
       </w:r>
       <w:r>
         <w:rPr>
@@ -36958,7 +37266,7 @@
         <w:rPr>
           <w:rStyle w:val="AttributeTok"/>
         </w:rPr>
-        <w:t>-address</w:t>
+        <w:t>-in-subnet</w:t>
       </w:r>
       <w:r>
         <w:br/>
@@ -36976,14 +37284,14 @@
         <w:rPr>
           <w:rStyle w:val="CommentTok"/>
         </w:rPr>
-        <w:t># --- Management IPs (</w:t>
+        <w:t># --- ISL subnets (</w:t>
       </w:r>
       <w:proofErr w:type="spellStart"/>
       <w:r>
         <w:rPr>
           <w:rStyle w:val="CommentTok"/>
         </w:rPr>
-        <w:t>IPInSubnetAllocationPool</w:t>
+        <w:t>SubnetAllocationPool</w:t>
       </w:r>
       <w:proofErr w:type="spellEnd"/>
       <w:r>
@@ -37076,7 +37384,7 @@
         <w:rPr>
           <w:rStyle w:val="AttributeTok"/>
         </w:rPr>
-        <w:t xml:space="preserve"> nb-fabric-dc2-mgmt</w:t>
+        <w:t xml:space="preserve"> nb-fabric-dc2-isl</w:t>
       </w:r>
       <w:r>
         <w:br/>
@@ -37225,7 +37533,7 @@
         <w:rPr>
           <w:rStyle w:val="AttributeTok"/>
         </w:rPr>
-        <w:t>eda-fabric-dc2-mgmt</w:t>
+        <w:t>eda-fabric-dc2-isl</w:t>
       </w:r>
       <w:r>
         <w:rPr>
@@ -37240,321 +37548,6 @@
         <w:rPr>
           <w:rStyle w:val="AttributeTok"/>
         </w:rPr>
-        <w:t xml:space="preserve">  </w:t>
-      </w:r>
-      <w:r>
-        <w:rPr>
-          <w:rStyle w:val="FunctionTok"/>
-        </w:rPr>
-        <w:t>type</w:t>
-      </w:r>
-      <w:r>
-        <w:rPr>
-          <w:rStyle w:val="KeywordTok"/>
-        </w:rPr>
-        <w:t>:</w:t>
-      </w:r>
-      <w:r>
-        <w:rPr>
-          <w:rStyle w:val="AttributeTok"/>
-        </w:rPr>
-        <w:t xml:space="preserve"> </w:t>
-      </w:r>
-      <w:proofErr w:type="spellStart"/>
-      <w:r>
-        <w:rPr>
-          <w:rStyle w:val="AttributeTok"/>
-        </w:rPr>
-        <w:t>ip</w:t>
-      </w:r>
-      <w:proofErr w:type="spellEnd"/>
-      <w:r>
-        <w:rPr>
-          <w:rStyle w:val="AttributeTok"/>
-        </w:rPr>
-        <w:t>-in-subnet</w:t>
-      </w:r>
-      <w:r>
-        <w:br/>
-      </w:r>
-      <w:r>
-        <w:rPr>
-          <w:rStyle w:val="PreprocessorTok"/>
-        </w:rPr>
-        <w:t>---</w:t>
-      </w:r>
-      <w:r>
-        <w:br/>
-      </w:r>
-      <w:r>
-        <w:rPr>
-          <w:rStyle w:val="CommentTok"/>
-        </w:rPr>
-        <w:t># --- ISL subnets (</w:t>
-      </w:r>
-      <w:proofErr w:type="spellStart"/>
-      <w:r>
-        <w:rPr>
-          <w:rStyle w:val="CommentTok"/>
-        </w:rPr>
-        <w:t>SubnetAllocationPool</w:t>
-      </w:r>
-      <w:proofErr w:type="spellEnd"/>
-      <w:r>
-        <w:rPr>
-          <w:rStyle w:val="CommentTok"/>
-        </w:rPr>
-        <w:t>) ---</w:t>
-      </w:r>
-      <w:r>
-        <w:br/>
-      </w:r>
-      <w:proofErr w:type="spellStart"/>
-      <w:r>
-        <w:rPr>
-          <w:rStyle w:val="FunctionTok"/>
-        </w:rPr>
-        <w:t>apiVersion</w:t>
-      </w:r>
-      <w:proofErr w:type="spellEnd"/>
-      <w:r>
-        <w:rPr>
-          <w:rStyle w:val="KeywordTok"/>
-        </w:rPr>
-        <w:t>:</w:t>
-      </w:r>
-      <w:r>
-        <w:rPr>
-          <w:rStyle w:val="AttributeTok"/>
-        </w:rPr>
-        <w:t xml:space="preserve"> netbox.eda.nokia.com/v1alpha1</w:t>
-      </w:r>
-      <w:r>
-        <w:br/>
-      </w:r>
-      <w:r>
-        <w:rPr>
-          <w:rStyle w:val="FunctionTok"/>
-        </w:rPr>
-        <w:t>kind</w:t>
-      </w:r>
-      <w:r>
-        <w:rPr>
-          <w:rStyle w:val="KeywordTok"/>
-        </w:rPr>
-        <w:t>:</w:t>
-      </w:r>
-      <w:r>
-        <w:rPr>
-          <w:rStyle w:val="AttributeTok"/>
-        </w:rPr>
-        <w:t xml:space="preserve"> Allocation</w:t>
-      </w:r>
-      <w:r>
-        <w:br/>
-      </w:r>
-      <w:r>
-        <w:rPr>
-          <w:rStyle w:val="FunctionTok"/>
-        </w:rPr>
-        <w:t>metadata</w:t>
-      </w:r>
-      <w:r>
-        <w:rPr>
-          <w:rStyle w:val="KeywordTok"/>
-        </w:rPr>
-        <w:t>:</w:t>
-      </w:r>
-      <w:r>
-        <w:br/>
-      </w:r>
-      <w:r>
-        <w:rPr>
-          <w:rStyle w:val="AttributeTok"/>
-        </w:rPr>
-        <w:t xml:space="preserve">  </w:t>
-      </w:r>
-      <w:r>
-        <w:rPr>
-          <w:rStyle w:val="FunctionTok"/>
-        </w:rPr>
-        <w:t>name</w:t>
-      </w:r>
-      <w:r>
-        <w:rPr>
-          <w:rStyle w:val="KeywordTok"/>
-        </w:rPr>
-        <w:t>:</w:t>
-      </w:r>
-      <w:r>
-        <w:rPr>
-          <w:rStyle w:val="AttributeTok"/>
-        </w:rPr>
-        <w:t xml:space="preserve"> nb-fabric-dc2-isl</w:t>
-      </w:r>
-      <w:r>
-        <w:br/>
-      </w:r>
-      <w:r>
-        <w:rPr>
-          <w:rStyle w:val="AttributeTok"/>
-        </w:rPr>
-        <w:t xml:space="preserve">  </w:t>
-      </w:r>
-      <w:r>
-        <w:rPr>
-          <w:rStyle w:val="FunctionTok"/>
-        </w:rPr>
-        <w:t>namespace</w:t>
-      </w:r>
-      <w:r>
-        <w:rPr>
-          <w:rStyle w:val="KeywordTok"/>
-        </w:rPr>
-        <w:t>:</w:t>
-      </w:r>
-      <w:r>
-        <w:rPr>
-          <w:rStyle w:val="AttributeTok"/>
-        </w:rPr>
-        <w:t xml:space="preserve"> fabric-dc2</w:t>
-      </w:r>
-      <w:r>
-        <w:br/>
-      </w:r>
-      <w:r>
-        <w:rPr>
-          <w:rStyle w:val="FunctionTok"/>
-        </w:rPr>
-        <w:t>spec</w:t>
-      </w:r>
-      <w:r>
-        <w:rPr>
-          <w:rStyle w:val="KeywordTok"/>
-        </w:rPr>
-        <w:t>:</w:t>
-      </w:r>
-      <w:r>
-        <w:br/>
-      </w:r>
-      <w:r>
-        <w:rPr>
-          <w:rStyle w:val="AttributeTok"/>
-        </w:rPr>
-        <w:t xml:space="preserve">  </w:t>
-      </w:r>
-      <w:r>
-        <w:rPr>
-          <w:rStyle w:val="FunctionTok"/>
-        </w:rPr>
-        <w:t>enabled</w:t>
-      </w:r>
-      <w:r>
-        <w:rPr>
-          <w:rStyle w:val="KeywordTok"/>
-        </w:rPr>
-        <w:t>:</w:t>
-      </w:r>
-      <w:r>
-        <w:rPr>
-          <w:rStyle w:val="AttributeTok"/>
-        </w:rPr>
-        <w:t xml:space="preserve"> </w:t>
-      </w:r>
-      <w:r>
-        <w:rPr>
-          <w:rStyle w:val="CharTok"/>
-        </w:rPr>
-        <w:t>true</w:t>
-      </w:r>
-      <w:r>
-        <w:br/>
-      </w:r>
-      <w:r>
-        <w:rPr>
-          <w:rStyle w:val="AttributeTok"/>
-        </w:rPr>
-        <w:t xml:space="preserve">  </w:t>
-      </w:r>
-      <w:r>
-        <w:rPr>
-          <w:rStyle w:val="FunctionTok"/>
-        </w:rPr>
-        <w:t>instance</w:t>
-      </w:r>
-      <w:r>
-        <w:rPr>
-          <w:rStyle w:val="KeywordTok"/>
-        </w:rPr>
-        <w:t>:</w:t>
-      </w:r>
-      <w:r>
-        <w:rPr>
-          <w:rStyle w:val="AttributeTok"/>
-        </w:rPr>
-        <w:t xml:space="preserve"> </w:t>
-      </w:r>
-      <w:proofErr w:type="spellStart"/>
-      <w:r>
-        <w:rPr>
-          <w:rStyle w:val="AttributeTok"/>
-        </w:rPr>
-        <w:t>netbox</w:t>
-      </w:r>
-      <w:proofErr w:type="spellEnd"/>
-      <w:r>
-        <w:br/>
-      </w:r>
-      <w:r>
-        <w:rPr>
-          <w:rStyle w:val="AttributeTok"/>
-        </w:rPr>
-        <w:t xml:space="preserve">  </w:t>
-      </w:r>
-      <w:r>
-        <w:rPr>
-          <w:rStyle w:val="FunctionTok"/>
-        </w:rPr>
-        <w:t>tags</w:t>
-      </w:r>
-      <w:r>
-        <w:rPr>
-          <w:rStyle w:val="KeywordTok"/>
-        </w:rPr>
-        <w:t>:</w:t>
-      </w:r>
-      <w:r>
-        <w:rPr>
-          <w:rStyle w:val="AttributeTok"/>
-        </w:rPr>
-        <w:t xml:space="preserve"> </w:t>
-      </w:r>
-      <w:r>
-        <w:rPr>
-          <w:rStyle w:val="KeywordTok"/>
-        </w:rPr>
-        <w:t>[</w:t>
-      </w:r>
-      <w:r>
-        <w:rPr>
-          <w:rStyle w:val="AttributeTok"/>
-        </w:rPr>
-        <w:t>eda-fabric-dc2-isl</w:t>
-      </w:r>
-      <w:r>
-        <w:rPr>
-          <w:rStyle w:val="KeywordTok"/>
-        </w:rPr>
-        <w:t>]</w:t>
-      </w:r>
-      <w:r>
-        <w:br/>
-      </w:r>
-      <w:r>
-        <w:rPr>
-          <w:rStyle w:val="AttributeTok"/>
-        </w:rPr>
-        <w:lastRenderedPageBreak/>
         <w:t xml:space="preserve">  </w:t>
       </w:r>
       <w:r>
@@ -37708,6 +37701,7 @@
           <w:p>
             <w:proofErr w:type="spellStart"/>
             <w:r>
+              <w:lastRenderedPageBreak/>
               <w:t>vlan</w:t>
             </w:r>
             <w:proofErr w:type="spellEnd"/>
@@ -38573,7 +38567,6 @@
       </w:pPr>
       <w:bookmarkStart w:id="113" w:name="run-all-pools-script"/>
       <w:r>
-        <w:lastRenderedPageBreak/>
         <w:t>6.4.0 Run all pools (script)</w:t>
       </w:r>
     </w:p>
@@ -38586,10 +38579,7 @@
         <w:t>File:</w:t>
       </w:r>
       <w:r>
-        <w:t xml:space="preserve"> nb-test-allocation-pools-fabric-dc2.py</w:t>
-      </w:r>
-      <w:r>
-        <w:t>. Creates all five objects + tags in one run:</w:t>
+        <w:t xml:space="preserve"> nb-test-allocation-pools-fabric-dc2.py. Creates all five objects + tags in one run:</w:t>
       </w:r>
     </w:p>
     <w:p>
@@ -38783,6 +38773,7 @@
         <w:rPr>
           <w:rStyle w:val="ExtensionTok"/>
         </w:rPr>
+        <w:lastRenderedPageBreak/>
         <w:t>kubectl</w:t>
       </w:r>
       <w:proofErr w:type="spellEnd"/>
@@ -39802,7 +39793,6 @@
                 <w:b/>
                 <w:bCs/>
               </w:rPr>
-              <w:lastRenderedPageBreak/>
               <w:t>EDA pool CRD</w:t>
             </w:r>
           </w:p>
@@ -39894,6 +39884,7 @@
                 <w:b/>
                 <w:bCs/>
               </w:rPr>
+              <w:lastRenderedPageBreak/>
               <w:t>NetBox</w:t>
             </w:r>
             <w:proofErr w:type="spellEnd"/>
@@ -40825,7 +40816,6 @@
           </w:tcPr>
           <w:p>
             <w:r>
-              <w:lastRenderedPageBreak/>
               <w:t>Allocation CR</w:t>
             </w:r>
           </w:p>
@@ -40999,6 +40989,7 @@
           </w:tcPr>
           <w:p>
             <w:r>
+              <w:lastRenderedPageBreak/>
               <w:t>nb-clab3tier-isl</w:t>
             </w:r>
           </w:p>
@@ -42034,7 +42025,6 @@
       <w:bookmarkStart w:id="126" w:name="X42fc3711805a67f4c16dcd62e41aa48e0e70fea"/>
       <w:bookmarkEnd w:id="124"/>
       <w:r>
-        <w:lastRenderedPageBreak/>
         <w:t xml:space="preserve">7.1.1 Bootstrap allocation pools vs </w:t>
       </w:r>
       <w:proofErr w:type="spellStart"/>
@@ -42094,6 +42084,7 @@
           </w:tcPr>
           <w:p>
             <w:r>
+              <w:lastRenderedPageBreak/>
               <w:t>Source</w:t>
             </w:r>
           </w:p>
@@ -42882,7 +42873,6 @@
           <w:p>
             <w:proofErr w:type="spellStart"/>
             <w:r>
-              <w:lastRenderedPageBreak/>
               <w:t>NetBox</w:t>
             </w:r>
             <w:proofErr w:type="spellEnd"/>
@@ -42970,6 +42960,7 @@
           <w:b/>
           <w:bCs/>
         </w:rPr>
+        <w:lastRenderedPageBreak/>
         <w:t>Shared IPAM pools</w:t>
       </w:r>
       <w:r>
@@ -43588,7 +43579,6 @@
           </w:tcPr>
           <w:p>
             <w:r>
-              <w:lastRenderedPageBreak/>
               <w:t>Access from</w:t>
             </w:r>
           </w:p>
@@ -43762,6 +43752,7 @@
           </w:tcPr>
           <w:p>
             <w:r>
+              <w:lastRenderedPageBreak/>
               <w:t>Namespace</w:t>
             </w:r>
           </w:p>
@@ -44568,11 +44559,7 @@
             </w:r>
             <w:proofErr w:type="spellEnd"/>
             <w:r>
-              <w:t xml:space="preserve">-managed import only </w:t>
-            </w:r>
-            <w:r>
-              <w:lastRenderedPageBreak/>
-              <w:t>(</w:t>
+              <w:t>-managed import only (</w:t>
             </w:r>
             <w:proofErr w:type="spellStart"/>
             <w:proofErr w:type="gramStart"/>
@@ -44592,7 +44579,6 @@
           </w:tcPr>
           <w:p>
             <w:r>
-              <w:lastRenderedPageBreak/>
               <w:t xml:space="preserve">IPAM: </w:t>
             </w:r>
             <w:proofErr w:type="spellStart"/>
@@ -44601,11 +44587,7 @@
             </w:r>
             <w:proofErr w:type="spellEnd"/>
             <w:r>
-              <w:t xml:space="preserve"> (for </w:t>
-            </w:r>
-            <w:r>
-              <w:lastRenderedPageBreak/>
-              <w:t xml:space="preserve">allocations); DCIM: </w:t>
+              <w:t xml:space="preserve"> (for allocations); DCIM: </w:t>
             </w:r>
             <w:r>
               <w:rPr>
@@ -44623,7 +44605,6 @@
           <w:p>
             <w:proofErr w:type="spellStart"/>
             <w:r>
-              <w:lastRenderedPageBreak/>
               <w:t>ApplyTopology</w:t>
             </w:r>
             <w:proofErr w:type="spellEnd"/>
@@ -44638,11 +44619,7 @@
               <w:t>reads</w:t>
             </w:r>
             <w:r>
-              <w:t xml:space="preserve"> </w:t>
-            </w:r>
-            <w:r>
-              <w:lastRenderedPageBreak/>
-              <w:t>site/devices/cables; it does not write DCIM back</w:t>
+              <w:t xml:space="preserve"> site/devices/cables; it does not write DCIM back</w:t>
             </w:r>
           </w:p>
         </w:tc>
@@ -44654,7 +44631,6 @@
           </w:tcPr>
           <w:p>
             <w:r>
-              <w:lastRenderedPageBreak/>
               <w:t>EDA-managed sync (</w:t>
             </w:r>
             <w:proofErr w:type="spellStart"/>
@@ -44787,6 +44763,7 @@
     </w:p>
     <w:p>
       <w:r>
+        <w:lastRenderedPageBreak/>
         <w:pict w14:anchorId="252E036A">
           <v:rect id="_x0000_i1045" style="width:0;height:1.5pt" o:hralign="center" o:hrstd="t" o:hr="t"/>
         </w:pict>
@@ -45522,7 +45499,6 @@
           </w:tcPr>
           <w:p>
             <w:r>
-              <w:lastRenderedPageBreak/>
               <w:t xml:space="preserve">Add </w:t>
             </w:r>
             <w:proofErr w:type="spellStart"/>
@@ -45681,6 +45657,7 @@
           </w:tcPr>
           <w:p>
             <w:r>
+              <w:lastRenderedPageBreak/>
               <w:t>Transaction ops on named CRs</w:t>
             </w:r>
           </w:p>
@@ -46208,7 +46185,6 @@
         <w:pStyle w:val="Heading2"/>
       </w:pPr>
       <w:r>
-        <w:lastRenderedPageBreak/>
         <w:t>References</w:t>
       </w:r>
     </w:p>
@@ -46264,6 +46240,7 @@
         <w:rPr>
           <w:b/>
         </w:rPr>
+        <w:lastRenderedPageBreak/>
         <w:t xml:space="preserve">This summary: </w:t>
       </w:r>
       <w:r>

</xml_diff>